<commit_message>
feat: unify CAT 1 and CAT 2 templates to match CAT 3 2021 format
</commit_message>
<xml_diff>
--- a/backend/templates/QPGEN CAT2 - QP Pattern.docx
+++ b/backend/templates/QPGEN CAT2 - QP Pattern.docx
@@ -37,209 +37,13 @@
     </w:p>
     <w:tbl>
       <w:tblPr>
-        <w:tblW w:w="5069" w:type="dxa"/>
-        <w:tblInd w:w="5749" w:type="dxa"/>
-        <w:tblBorders>
-          <w:top w:val="double" w:sz="12" w:space="0" w:color="auto"/>
-          <w:left w:val="double" w:sz="12" w:space="0" w:color="auto"/>
-          <w:bottom w:val="double" w:sz="12" w:space="0" w:color="auto"/>
-          <w:right w:val="double" w:sz="12" w:space="0" w:color="auto"/>
-          <w:insideH w:val="double" w:sz="12" w:space="0" w:color="auto"/>
-          <w:insideV w:val="double" w:sz="12" w:space="0" w:color="auto"/>
-        </w:tblBorders>
-        <w:tblLayout w:type="fixed"/>
-        <w:tblCellMar>
-          <w:left w:w="0" w:type="dxa"/>
-          <w:right w:w="0" w:type="dxa"/>
-        </w:tblCellMar>
-        <w:tblLook w:val="0000" w:firstRow="0" w:lastRow="0" w:firstColumn="0" w:lastColumn="0" w:noHBand="0" w:noVBand="0"/>
-      </w:tblPr>
-      <w:tblGrid>
-        <w:gridCol w:w="388"/>
-        <w:gridCol w:w="389"/>
-        <w:gridCol w:w="389"/>
-        <w:gridCol w:w="389"/>
-        <w:gridCol w:w="388"/>
-        <w:gridCol w:w="389"/>
-        <w:gridCol w:w="389"/>
-        <w:gridCol w:w="389"/>
-        <w:gridCol w:w="388"/>
-        <w:gridCol w:w="389"/>
-        <w:gridCol w:w="389"/>
-        <w:gridCol w:w="389"/>
-        <w:gridCol w:w="404"/>
-      </w:tblGrid>
-      <w:tr>
-        <w:trPr>
-          <w:trHeight w:val="315"/>
-        </w:trPr>
-        <w:tc>
-          <w:tcPr>
-            <w:tcW w:w="388" w:type="dxa"/>
-          </w:tcPr>
-          <w:p>
-            <w:pPr>
-              <w:pStyle w:val="TableParagraph"/>
-              <w:ind w:left="-347"/>
-              <w:jc w:val="left"/>
-            </w:pPr>
-          </w:p>
-        </w:tc>
-        <w:tc>
-          <w:tcPr>
-            <w:tcW w:w="389" w:type="dxa"/>
-          </w:tcPr>
-          <w:p>
-            <w:pPr>
-              <w:pStyle w:val="TableParagraph"/>
-              <w:ind w:left="-347"/>
-              <w:jc w:val="left"/>
-            </w:pPr>
-          </w:p>
-        </w:tc>
-        <w:tc>
-          <w:tcPr>
-            <w:tcW w:w="389" w:type="dxa"/>
-          </w:tcPr>
-          <w:p>
-            <w:pPr>
-              <w:pStyle w:val="TableParagraph"/>
-              <w:ind w:left="-347"/>
-              <w:jc w:val="left"/>
-            </w:pPr>
-          </w:p>
-        </w:tc>
-        <w:tc>
-          <w:tcPr>
-            <w:tcW w:w="389" w:type="dxa"/>
-          </w:tcPr>
-          <w:p>
-            <w:pPr>
-              <w:pStyle w:val="TableParagraph"/>
-              <w:ind w:left="-347"/>
-              <w:jc w:val="left"/>
-            </w:pPr>
-          </w:p>
-        </w:tc>
-        <w:tc>
-          <w:tcPr>
-            <w:tcW w:w="388" w:type="dxa"/>
-          </w:tcPr>
-          <w:p>
-            <w:pPr>
-              <w:pStyle w:val="TableParagraph"/>
-              <w:ind w:left="-347"/>
-              <w:jc w:val="left"/>
-            </w:pPr>
-          </w:p>
-        </w:tc>
-        <w:tc>
-          <w:tcPr>
-            <w:tcW w:w="389" w:type="dxa"/>
-          </w:tcPr>
-          <w:p>
-            <w:pPr>
-              <w:pStyle w:val="TableParagraph"/>
-              <w:ind w:left="-347"/>
-              <w:jc w:val="left"/>
-            </w:pPr>
-          </w:p>
-        </w:tc>
-        <w:tc>
-          <w:tcPr>
-            <w:tcW w:w="389" w:type="dxa"/>
-          </w:tcPr>
-          <w:p>
-            <w:pPr>
-              <w:pStyle w:val="TableParagraph"/>
-              <w:ind w:left="-347"/>
-              <w:jc w:val="left"/>
-            </w:pPr>
-          </w:p>
-        </w:tc>
-        <w:tc>
-          <w:tcPr>
-            <w:tcW w:w="389" w:type="dxa"/>
-          </w:tcPr>
-          <w:p>
-            <w:pPr>
-              <w:pStyle w:val="TableParagraph"/>
-              <w:ind w:left="-347"/>
-              <w:jc w:val="left"/>
-            </w:pPr>
-          </w:p>
-        </w:tc>
-        <w:tc>
-          <w:tcPr>
-            <w:tcW w:w="388" w:type="dxa"/>
-          </w:tcPr>
-          <w:p>
-            <w:pPr>
-              <w:pStyle w:val="TableParagraph"/>
-              <w:ind w:left="-347"/>
-              <w:jc w:val="left"/>
-            </w:pPr>
-          </w:p>
-        </w:tc>
-        <w:tc>
-          <w:tcPr>
-            <w:tcW w:w="389" w:type="dxa"/>
-          </w:tcPr>
-          <w:p>
-            <w:pPr>
-              <w:pStyle w:val="TableParagraph"/>
-              <w:ind w:left="-347"/>
-              <w:jc w:val="left"/>
-            </w:pPr>
-          </w:p>
-        </w:tc>
-        <w:tc>
-          <w:tcPr>
-            <w:tcW w:w="389" w:type="dxa"/>
-          </w:tcPr>
-          <w:p>
-            <w:pPr>
-              <w:pStyle w:val="TableParagraph"/>
-              <w:ind w:left="-347"/>
-              <w:jc w:val="left"/>
-            </w:pPr>
-          </w:p>
-        </w:tc>
-        <w:tc>
-          <w:tcPr>
-            <w:tcW w:w="389" w:type="dxa"/>
-          </w:tcPr>
-          <w:p>
-            <w:pPr>
-              <w:pStyle w:val="TableParagraph"/>
-              <w:ind w:left="-347"/>
-              <w:jc w:val="left"/>
-            </w:pPr>
-          </w:p>
-        </w:tc>
-        <w:tc>
-          <w:tcPr>
-            <w:tcW w:w="404" w:type="dxa"/>
-          </w:tcPr>
-          <w:p>
-            <w:pPr>
-              <w:pStyle w:val="TableParagraph"/>
-              <w:ind w:left="-347"/>
-              <w:jc w:val="left"/>
-            </w:pPr>
-          </w:p>
-        </w:tc>
-      </w:tr>
-    </w:tbl>
-    <w:tbl>
-      <w:tblPr>
         <w:tblStyle w:val="TableGrid"/>
-        <w:tblW w:w="10881" w:type="dxa"/>
+        <w:tblW w:w="10773" w:type="dxa"/>
+        <w:tblInd w:w="108" w:type="dxa"/>
         <w:tblLayout w:type="fixed"/>
         <w:tblLook w:val="04A0" w:firstRow="1" w:lastRow="0" w:firstColumn="1" w:lastColumn="0" w:noHBand="0" w:noVBand="1"/>
       </w:tblPr>
       <w:tblGrid>
-        <w:gridCol w:w="108"/>
         <w:gridCol w:w="1620"/>
         <w:gridCol w:w="6318"/>
         <w:gridCol w:w="1276"/>
@@ -247,8 +51,6 @@
       </w:tblGrid>
       <w:tr>
         <w:trPr>
-          <w:gridBefore w:val="1"/>
-          <w:wBefore w:w="108" w:type="dxa"/>
           <w:trHeight w:val="1661"/>
         </w:trPr>
         <w:tc>
@@ -280,7 +82,7 @@
                 <w:sz w:val="20"/>
               </w:rPr>
               <w:drawing>
-                <wp:inline distT="0" distB="0" distL="0" distR="0" wp14:anchorId="69C389E0" wp14:editId="0D8D58D4">
+                <wp:inline distT="0" distB="0" distL="0" distR="0" wp14:anchorId="5F309174" wp14:editId="6548E9CD">
                   <wp:extent cx="1028700" cy="904875"/>
                   <wp:effectExtent l="0" t="0" r="0" b="0"/>
                   <wp:docPr id="4" name="Image 2" descr="NEW LOGO JET"/>
@@ -401,14 +203,12 @@
               </w:rPr>
               <w:t xml:space="preserve">(Approved by </w:t>
             </w:r>
-            <w:proofErr w:type="gramStart"/>
-            <w:r>
-              <w:rPr>
-                <w:b/>
-              </w:rPr>
-              <w:t>AICTE ,</w:t>
-            </w:r>
-            <w:proofErr w:type="gramEnd"/>
+            <w:r>
+              <w:rPr>
+                <w:b/>
+              </w:rPr>
+              <w:t>AICTE,</w:t>
+            </w:r>
             <w:r>
               <w:rPr>
                 <w:b/>
@@ -441,35 +241,14 @@
                 <w:b/>
                 <w:spacing w:val="-2"/>
               </w:rPr>
-              <w:t xml:space="preserve">                                             </w:t>
-            </w:r>
-            <w:r>
-              <w:rPr>
-                <w:b/>
-                <w:spacing w:val="-2"/>
-              </w:rPr>
-              <w:t xml:space="preserve">      </w:t>
-            </w:r>
-            <w:r>
-              <w:rPr>
-                <w:b/>
-                <w:spacing w:val="-2"/>
-              </w:rPr>
-              <w:t xml:space="preserve"> </w:t>
-            </w:r>
-            <w:r>
-              <w:rPr>
-                <w:b/>
-                <w:sz w:val="24"/>
-              </w:rPr>
-              <w:t>Chennai, Tamil</w:t>
-            </w:r>
-            <w:r>
-              <w:rPr>
-                <w:b/>
-                <w:sz w:val="24"/>
-              </w:rPr>
-              <w:t xml:space="preserve"> </w:t>
+              <w:t xml:space="preserve">                                                    </w:t>
+            </w:r>
+            <w:r>
+              <w:rPr>
+                <w:b/>
+                <w:sz w:val="24"/>
+              </w:rPr>
+              <w:t xml:space="preserve">Chennai, Tamil </w:t>
             </w:r>
             <w:r>
               <w:rPr>
@@ -501,12 +280,13 @@
           </w:tblBorders>
         </w:tblPrEx>
         <w:trPr>
-          <w:trHeight w:val="492"/>
+          <w:trHeight w:val="465"/>
         </w:trPr>
         <w:tc>
           <w:tcPr>
-            <w:tcW w:w="8046" w:type="dxa"/>
-            <w:gridSpan w:val="3"/>
+            <w:tcW w:w="7938" w:type="dxa"/>
+            <w:gridSpan w:val="2"/>
+            <w:vMerge w:val="restart"/>
             <w:tcBorders>
               <w:right w:val="thinThickSmallGap" w:sz="12" w:space="0" w:color="auto"/>
             </w:tcBorders>
@@ -514,59 +294,27 @@
           </w:tcPr>
           <w:p>
             <w:pPr>
-              <w:spacing w:line="276" w:lineRule="auto"/>
               <w:jc w:val="center"/>
-              <w:rPr>
+            </w:pPr>
+            <w:r/>
+            <w:r>
+              <w:rPr>
+                <w:rFonts w:ascii="Times New Roman" w:hAnsi="Times New Roman"/>
                 <w:b/>
                 <w:sz w:val="28"/>
-                <w:szCs w:val="24"/>
                 <w:u w:val="single"/>
               </w:rPr>
-            </w:pPr>
-            <w:r>
-              <w:rPr>
-                <w:b/>
-                <w:sz w:val="28"/>
-                <w:szCs w:val="24"/>
-              </w:rPr>
-              <w:t xml:space="preserve">                                  </w:t>
-            </w:r>
-            <w:r>
-              <w:rPr>
-                <w:b/>
-                <w:sz w:val="28"/>
-                <w:szCs w:val="24"/>
-                <w:u w:val="single"/>
-              </w:rPr>
-              <w:t>CONTINUOUS ASSESSMENT TEST- I</w:t>
-            </w:r>
-            <w:r>
-              <w:rPr>
-                <w:b/>
-                <w:sz w:val="28"/>
-                <w:szCs w:val="24"/>
-                <w:u w:val="single"/>
-              </w:rPr>
-              <w:t>I</w:t>
-            </w:r>
-            <w:r>
-              <w:rPr>
-                <w:b/>
-                <w:sz w:val="28"/>
-                <w:szCs w:val="24"/>
-                <w:u w:val="single"/>
-              </w:rPr>
-              <w:t xml:space="preserve">   </w:t>
+              <w:t>CONTINUOUS ASSESSMENT TEST- II</w:t>
             </w:r>
           </w:p>
         </w:tc>
         <w:tc>
           <w:tcPr>
             <w:tcW w:w="1276" w:type="dxa"/>
+            <w:vMerge w:val="restart"/>
             <w:tcBorders>
               <w:top w:val="thinThickSmallGap" w:sz="12" w:space="0" w:color="auto"/>
               <w:left w:val="thinThickSmallGap" w:sz="12" w:space="0" w:color="auto"/>
-              <w:bottom w:val="thinThickSmallGap" w:sz="12" w:space="0" w:color="auto"/>
               <w:right w:val="thinThickSmallGap" w:sz="12" w:space="0" w:color="auto"/>
             </w:tcBorders>
             <w:vAlign w:val="center"/>
@@ -574,7 +322,24 @@
           <w:p>
             <w:pPr>
               <w:spacing w:line="360" w:lineRule="auto"/>
-              <w:jc w:val="center"/>
+              <w:rPr>
+                <w:b/>
+                <w:sz w:val="24"/>
+                <w:szCs w:val="24"/>
+              </w:rPr>
+            </w:pPr>
+            <w:r>
+              <w:rPr>
+                <w:b/>
+                <w:sz w:val="24"/>
+                <w:szCs w:val="24"/>
+              </w:rPr>
+              <w:t>DATE/</w:t>
+            </w:r>
+          </w:p>
+          <w:p>
+            <w:pPr>
+              <w:spacing w:line="360" w:lineRule="auto"/>
               <w:rPr>
                 <w:b/>
                 <w:sz w:val="28"/>
@@ -587,7 +352,7 @@
                 <w:sz w:val="24"/>
                 <w:szCs w:val="24"/>
               </w:rPr>
-              <w:t>DATE</w:t>
+              <w:t>SESSION</w:t>
             </w:r>
           </w:p>
         </w:tc>
@@ -597,7 +362,7 @@
             <w:tcBorders>
               <w:top w:val="thinThickSmallGap" w:sz="12" w:space="0" w:color="auto"/>
               <w:left w:val="thinThickSmallGap" w:sz="12" w:space="0" w:color="auto"/>
-              <w:bottom w:val="thinThickSmallGap" w:sz="12" w:space="0" w:color="auto"/>
+              <w:bottom w:val="single" w:sz="4" w:space="0" w:color="auto"/>
               <w:right w:val="thinThickSmallGap" w:sz="12" w:space="0" w:color="auto"/>
             </w:tcBorders>
             <w:vAlign w:val="center"/>
@@ -626,10 +391,14 @@
             <w:insideV w:val="none" w:sz="0" w:space="0" w:color="auto"/>
           </w:tblBorders>
         </w:tblPrEx>
-        <w:tc>
-          <w:tcPr>
-            <w:tcW w:w="8046" w:type="dxa"/>
-            <w:gridSpan w:val="3"/>
+        <w:trPr>
+          <w:trHeight w:val="80"/>
+        </w:trPr>
+        <w:tc>
+          <w:tcPr>
+            <w:tcW w:w="7938" w:type="dxa"/>
+            <w:gridSpan w:val="2"/>
+            <w:vMerge/>
             <w:tcBorders>
               <w:right w:val="thinThickSmallGap" w:sz="12" w:space="0" w:color="auto"/>
             </w:tcBorders>
@@ -640,47 +409,18 @@
               <w:spacing w:line="276" w:lineRule="auto"/>
               <w:jc w:val="center"/>
               <w:rPr>
+                <w:b/>
                 <w:sz w:val="28"/>
                 <w:szCs w:val="24"/>
               </w:rPr>
             </w:pPr>
-            <w:r>
-              <w:rPr>
-                <w:b/>
-                <w:sz w:val="28"/>
-                <w:szCs w:val="24"/>
-              </w:rPr>
-              <w:t xml:space="preserve">                                </w:t>
-            </w:r>
-            <w:r>
-              <w:rPr>
-                <w:b/>
-                <w:sz w:val="28"/>
-                <w:szCs w:val="24"/>
-              </w:rPr>
-              <w:t xml:space="preserve">   </w:t>
-            </w:r>
-            <w:r>
-              <w:rPr>
-                <w:sz w:val="28"/>
-                <w:szCs w:val="24"/>
-              </w:rPr>
-              <w:t xml:space="preserve"> (2021</w:t>
-            </w:r>
-            <w:r>
-              <w:rPr>
-                <w:sz w:val="28"/>
-                <w:szCs w:val="24"/>
-              </w:rPr>
-              <w:t>-REGULATION)</w:t>
-            </w:r>
           </w:p>
         </w:tc>
         <w:tc>
           <w:tcPr>
             <w:tcW w:w="1276" w:type="dxa"/>
+            <w:vMerge/>
             <w:tcBorders>
-              <w:top w:val="thinThickSmallGap" w:sz="12" w:space="0" w:color="auto"/>
               <w:left w:val="thinThickSmallGap" w:sz="12" w:space="0" w:color="auto"/>
               <w:bottom w:val="thinThickSmallGap" w:sz="12" w:space="0" w:color="auto"/>
               <w:right w:val="thinThickSmallGap" w:sz="12" w:space="0" w:color="auto"/>
@@ -690,28 +430,19 @@
           <w:p>
             <w:pPr>
               <w:spacing w:line="360" w:lineRule="auto"/>
-              <w:jc w:val="center"/>
-              <w:rPr>
-                <w:b/>
-                <w:sz w:val="24"/>
-                <w:szCs w:val="24"/>
-              </w:rPr>
-            </w:pPr>
-            <w:r>
-              <w:rPr>
-                <w:b/>
-                <w:sz w:val="24"/>
-                <w:szCs w:val="24"/>
-              </w:rPr>
-              <w:t>PAGES</w:t>
-            </w:r>
+              <w:rPr>
+                <w:b/>
+                <w:sz w:val="24"/>
+                <w:szCs w:val="24"/>
+              </w:rPr>
+            </w:pPr>
           </w:p>
         </w:tc>
         <w:tc>
           <w:tcPr>
             <w:tcW w:w="1559" w:type="dxa"/>
             <w:tcBorders>
-              <w:top w:val="thinThickSmallGap" w:sz="12" w:space="0" w:color="auto"/>
+              <w:top w:val="single" w:sz="4" w:space="0" w:color="auto"/>
               <w:left w:val="thinThickSmallGap" w:sz="12" w:space="0" w:color="auto"/>
               <w:bottom w:val="thinThickSmallGap" w:sz="12" w:space="0" w:color="auto"/>
               <w:right w:val="thinThickSmallGap" w:sz="12" w:space="0" w:color="auto"/>
@@ -742,10 +473,13 @@
             <w:insideV w:val="none" w:sz="0" w:space="0" w:color="auto"/>
           </w:tblBorders>
         </w:tblPrEx>
-        <w:tc>
-          <w:tcPr>
-            <w:tcW w:w="8046" w:type="dxa"/>
-            <w:gridSpan w:val="3"/>
+        <w:trPr>
+          <w:trHeight w:val="273"/>
+        </w:trPr>
+        <w:tc>
+          <w:tcPr>
+            <w:tcW w:w="7938" w:type="dxa"/>
+            <w:gridSpan w:val="2"/>
             <w:tcBorders>
               <w:right w:val="thinThickSmallGap" w:sz="12" w:space="0" w:color="auto"/>
             </w:tcBorders>
@@ -773,28 +507,14 @@
                 <w:sz w:val="28"/>
                 <w:szCs w:val="24"/>
               </w:rPr>
-              <w:t>ODD</w:t>
+              <w:t xml:space="preserve"> (2021</w:t>
             </w:r>
             <w:r>
               <w:rPr>
                 <w:sz w:val="28"/>
                 <w:szCs w:val="24"/>
               </w:rPr>
-              <w:t xml:space="preserve"> SEMESTER 2026</w:t>
-            </w:r>
-            <w:r>
-              <w:rPr>
-                <w:sz w:val="28"/>
-                <w:szCs w:val="24"/>
-              </w:rPr>
-              <w:t>-2</w:t>
-            </w:r>
-            <w:r>
-              <w:rPr>
-                <w:sz w:val="28"/>
-                <w:szCs w:val="24"/>
-              </w:rPr>
-              <w:t>7</w:t>
+              <w:t>-REGULATION)</w:t>
             </w:r>
           </w:p>
         </w:tc>
@@ -812,20 +532,19 @@
           <w:p>
             <w:pPr>
               <w:spacing w:line="360" w:lineRule="auto"/>
-              <w:jc w:val="center"/>
-              <w:rPr>
-                <w:b/>
-                <w:sz w:val="24"/>
-                <w:szCs w:val="24"/>
-              </w:rPr>
-            </w:pPr>
-            <w:r>
-              <w:rPr>
-                <w:b/>
-                <w:sz w:val="24"/>
-                <w:szCs w:val="24"/>
-              </w:rPr>
-              <w:t>COPIES</w:t>
+              <w:rPr>
+                <w:b/>
+                <w:sz w:val="24"/>
+                <w:szCs w:val="24"/>
+              </w:rPr>
+            </w:pPr>
+            <w:r>
+              <w:rPr>
+                <w:b/>
+                <w:sz w:val="24"/>
+                <w:szCs w:val="24"/>
+              </w:rPr>
+              <w:t>PAGES</w:t>
             </w:r>
           </w:p>
         </w:tc>
@@ -853,17 +572,149 @@
           </w:p>
         </w:tc>
       </w:tr>
+      <w:tr>
+        <w:tblPrEx>
+          <w:tblBorders>
+            <w:top w:val="none" w:sz="0" w:space="0" w:color="auto"/>
+            <w:left w:val="none" w:sz="0" w:space="0" w:color="auto"/>
+            <w:bottom w:val="none" w:sz="0" w:space="0" w:color="auto"/>
+            <w:right w:val="none" w:sz="0" w:space="0" w:color="auto"/>
+            <w:insideH w:val="none" w:sz="0" w:space="0" w:color="auto"/>
+            <w:insideV w:val="none" w:sz="0" w:space="0" w:color="auto"/>
+          </w:tblBorders>
+        </w:tblPrEx>
+        <w:trPr>
+          <w:trHeight w:val="345"/>
+        </w:trPr>
+        <w:tc>
+          <w:tcPr>
+            <w:tcW w:w="7938" w:type="dxa"/>
+            <w:gridSpan w:val="2"/>
+            <w:tcBorders>
+              <w:right w:val="thinThickSmallGap" w:sz="12" w:space="0" w:color="auto"/>
+            </w:tcBorders>
+            <w:vAlign w:val="center"/>
+          </w:tcPr>
+          <w:p>
+            <w:pPr>
+              <w:spacing w:line="276" w:lineRule="auto"/>
+              <w:jc w:val="center"/>
+              <w:rPr>
+                <w:sz w:val="28"/>
+                <w:szCs w:val="24"/>
+              </w:rPr>
+            </w:pPr>
+            <w:r>
+              <w:rPr>
+                <w:b/>
+                <w:sz w:val="28"/>
+                <w:szCs w:val="24"/>
+              </w:rPr>
+              <w:t xml:space="preserve">                                   </w:t>
+            </w:r>
+            <w:r>
+              <w:rPr>
+                <w:sz w:val="28"/>
+                <w:szCs w:val="24"/>
+              </w:rPr>
+              <w:t>ODD</w:t>
+            </w:r>
+            <w:r>
+              <w:rPr>
+                <w:sz w:val="28"/>
+                <w:szCs w:val="24"/>
+              </w:rPr>
+              <w:t xml:space="preserve"> SEMESTER 2026</w:t>
+            </w:r>
+            <w:r>
+              <w:rPr>
+                <w:sz w:val="28"/>
+                <w:szCs w:val="24"/>
+              </w:rPr>
+              <w:t>-2</w:t>
+            </w:r>
+            <w:r>
+              <w:rPr>
+                <w:sz w:val="28"/>
+                <w:szCs w:val="24"/>
+              </w:rPr>
+              <w:t>7</w:t>
+            </w:r>
+          </w:p>
+        </w:tc>
+        <w:tc>
+          <w:tcPr>
+            <w:tcW w:w="1276" w:type="dxa"/>
+            <w:tcBorders>
+              <w:top w:val="thinThickSmallGap" w:sz="12" w:space="0" w:color="auto"/>
+              <w:left w:val="thinThickSmallGap" w:sz="12" w:space="0" w:color="auto"/>
+              <w:bottom w:val="thinThickSmallGap" w:sz="12" w:space="0" w:color="auto"/>
+              <w:right w:val="thinThickSmallGap" w:sz="12" w:space="0" w:color="auto"/>
+            </w:tcBorders>
+            <w:vAlign w:val="center"/>
+          </w:tcPr>
+          <w:p>
+            <w:pPr>
+              <w:spacing w:line="360" w:lineRule="auto"/>
+              <w:rPr>
+                <w:b/>
+                <w:sz w:val="24"/>
+                <w:szCs w:val="24"/>
+              </w:rPr>
+            </w:pPr>
+            <w:r>
+              <w:rPr>
+                <w:b/>
+                <w:sz w:val="24"/>
+                <w:szCs w:val="24"/>
+              </w:rPr>
+              <w:t>COPIES</w:t>
+            </w:r>
+          </w:p>
+        </w:tc>
+        <w:tc>
+          <w:tcPr>
+            <w:tcW w:w="1559" w:type="dxa"/>
+            <w:tcBorders>
+              <w:top w:val="thinThickSmallGap" w:sz="12" w:space="0" w:color="auto"/>
+              <w:left w:val="thinThickSmallGap" w:sz="12" w:space="0" w:color="auto"/>
+              <w:bottom w:val="thinThickSmallGap" w:sz="12" w:space="0" w:color="auto"/>
+              <w:right w:val="thinThickSmallGap" w:sz="12" w:space="0" w:color="auto"/>
+            </w:tcBorders>
+            <w:vAlign w:val="center"/>
+          </w:tcPr>
+          <w:p>
+            <w:pPr>
+              <w:spacing w:line="276" w:lineRule="auto"/>
+              <w:jc w:val="center"/>
+              <w:rPr>
+                <w:b/>
+                <w:sz w:val="28"/>
+                <w:szCs w:val="24"/>
+              </w:rPr>
+            </w:pPr>
+          </w:p>
+        </w:tc>
+      </w:tr>
     </w:tbl>
     <w:tbl>
       <w:tblPr>
         <w:tblStyle w:val="TableGrid"/>
-        <w:tblpPr w:leftFromText="180" w:rightFromText="180" w:vertAnchor="text" w:horzAnchor="margin" w:tblpY="189"/>
-        <w:tblW w:w="10859" w:type="dxa"/>
+        <w:tblpPr w:leftFromText="180" w:rightFromText="180" w:vertAnchor="text" w:horzAnchor="margin" w:tblpX="108" w:tblpY="189"/>
+        <w:tblW w:w="10751" w:type="dxa"/>
+        <w:tblBorders>
+          <w:top w:val="thinThickSmallGap" w:sz="12" w:space="0" w:color="auto"/>
+          <w:left w:val="thinThickSmallGap" w:sz="12" w:space="0" w:color="auto"/>
+          <w:bottom w:val="thickThinSmallGap" w:sz="12" w:space="0" w:color="auto"/>
+          <w:right w:val="thickThinSmallGap" w:sz="12" w:space="0" w:color="auto"/>
+          <w:insideH w:val="double" w:sz="4" w:space="0" w:color="auto"/>
+          <w:insideV w:val="double" w:sz="4" w:space="0" w:color="auto"/>
+        </w:tblBorders>
         <w:tblLayout w:type="fixed"/>
         <w:tblLook w:val="04A0" w:firstRow="1" w:lastRow="0" w:firstColumn="1" w:lastColumn="0" w:noHBand="0" w:noVBand="1"/>
       </w:tblPr>
       <w:tblGrid>
-        <w:gridCol w:w="5070"/>
+        <w:gridCol w:w="4962"/>
         <w:gridCol w:w="5789"/>
       </w:tblGrid>
       <w:tr>
@@ -873,21 +724,14 @@
         </w:trPr>
         <w:tc>
           <w:tcPr>
-            <w:tcW w:w="10859" w:type="dxa"/>
+            <w:tcW w:w="10751" w:type="dxa"/>
             <w:gridSpan w:val="2"/>
-            <w:tcBorders>
-              <w:top w:val="double" w:sz="4" w:space="0" w:color="auto"/>
-              <w:left w:val="double" w:sz="4" w:space="0" w:color="auto"/>
-              <w:bottom w:val="double" w:sz="4" w:space="0" w:color="auto"/>
-              <w:right w:val="double" w:sz="4" w:space="0" w:color="auto"/>
-            </w:tcBorders>
-            <w:shd w:val="clear" w:color="auto" w:fill="D9D9D9" w:themeFill="background1" w:themeFillShade="D9"/>
-            <w:vAlign w:val="bottom"/>
+            <w:shd w:val="clear" w:color="auto" w:fill="000000" w:themeFill="background1" w:themeFillShade="F2"/>
+            <w:vAlign w:val="center"/>
           </w:tcPr>
           <w:p>
             <w:pPr>
               <w:pStyle w:val="BodyText"/>
-              <w:spacing w:line="360" w:lineRule="auto"/>
               <w:rPr>
                 <w:b w:val="0"/>
                 <w:sz w:val="28"/>
@@ -901,15 +745,13 @@
               </w:rPr>
               <w:t xml:space="preserve">Sub. Code / Sub. </w:t>
             </w:r>
-            <w:proofErr w:type="gramStart"/>
-            <w:r>
-              <w:rPr>
-                <w:sz w:val="24"/>
-                <w:szCs w:val="24"/>
-              </w:rPr>
-              <w:t>Name  :</w:t>
-            </w:r>
-            <w:proofErr w:type="gramEnd"/>
+            <w:r>
+              <w:rPr>
+                <w:sz w:val="24"/>
+                <w:szCs w:val="24"/>
+              </w:rPr>
+              <w:t>Name:</w:t>
+            </w:r>
             <w:r>
               <w:rPr>
                 <w:sz w:val="24"/>
@@ -927,21 +769,14 @@
         </w:trPr>
         <w:tc>
           <w:tcPr>
-            <w:tcW w:w="5070" w:type="dxa"/>
-            <w:tcBorders>
-              <w:top w:val="double" w:sz="4" w:space="0" w:color="auto"/>
-              <w:left w:val="double" w:sz="4" w:space="0" w:color="auto"/>
-              <w:bottom w:val="double" w:sz="4" w:space="0" w:color="auto"/>
-              <w:right w:val="double" w:sz="4" w:space="0" w:color="auto"/>
-            </w:tcBorders>
-            <w:vAlign w:val="bottom"/>
-          </w:tcPr>
-          <w:p>
-            <w:pPr>
-              <w:spacing w:line="360" w:lineRule="auto"/>
-              <w:rPr>
-                <w:b/>
-                <w:sz w:val="24"/>
+            <w:tcW w:w="4962" w:type="dxa"/>
+            <w:vAlign w:val="center"/>
+          </w:tcPr>
+          <w:p>
+            <w:pPr>
+              <w:rPr>
+                <w:b/>
+                <w:sz w:val="28"/>
                 <w:szCs w:val="24"/>
               </w:rPr>
             </w:pPr>
@@ -957,18 +792,11 @@
         </w:tc>
         <w:tc>
           <w:tcPr>
-            <w:tcW w:w="5788" w:type="dxa"/>
-            <w:tcBorders>
-              <w:top w:val="double" w:sz="4" w:space="0" w:color="auto"/>
-              <w:left w:val="double" w:sz="4" w:space="0" w:color="auto"/>
-              <w:bottom w:val="double" w:sz="4" w:space="0" w:color="auto"/>
-              <w:right w:val="double" w:sz="4" w:space="0" w:color="auto"/>
-            </w:tcBorders>
-            <w:vAlign w:val="bottom"/>
-          </w:tcPr>
-          <w:p>
-            <w:pPr>
-              <w:spacing w:line="360" w:lineRule="auto"/>
+            <w:tcW w:w="5789" w:type="dxa"/>
+            <w:vAlign w:val="center"/>
+          </w:tcPr>
+          <w:p>
+            <w:pPr>
               <w:rPr>
                 <w:b/>
                 <w:sz w:val="28"/>
@@ -983,32 +811,14 @@
               </w:rPr>
               <w:t xml:space="preserve">Year / </w:t>
             </w:r>
-            <w:proofErr w:type="gramStart"/>
-            <w:r>
-              <w:rPr>
-                <w:b/>
-                <w:sz w:val="24"/>
-                <w:szCs w:val="24"/>
-              </w:rPr>
-              <w:t>Sem</w:t>
-            </w:r>
-            <w:r>
-              <w:rPr>
-                <w:b/>
-                <w:sz w:val="24"/>
-                <w:szCs w:val="24"/>
-              </w:rPr>
-              <w:t>ester</w:t>
-            </w:r>
-            <w:r>
-              <w:rPr>
-                <w:b/>
-                <w:sz w:val="24"/>
-                <w:szCs w:val="24"/>
-              </w:rPr>
-              <w:t xml:space="preserve"> :</w:t>
-            </w:r>
-            <w:proofErr w:type="gramEnd"/>
+            <w:r>
+              <w:rPr>
+                <w:b/>
+                <w:sz w:val="24"/>
+                <w:szCs w:val="24"/>
+              </w:rPr>
+              <w:t>Semester:</w:t>
+            </w:r>
             <w:r>
               <w:rPr>
                 <w:b/>
@@ -1027,18 +837,11 @@
         </w:trPr>
         <w:tc>
           <w:tcPr>
-            <w:tcW w:w="5070" w:type="dxa"/>
-            <w:tcBorders>
-              <w:top w:val="double" w:sz="4" w:space="0" w:color="auto"/>
-              <w:left w:val="double" w:sz="4" w:space="0" w:color="auto"/>
-              <w:bottom w:val="double" w:sz="4" w:space="0" w:color="auto"/>
-              <w:right w:val="double" w:sz="4" w:space="0" w:color="auto"/>
-            </w:tcBorders>
-            <w:vAlign w:val="bottom"/>
-          </w:tcPr>
-          <w:p>
-            <w:pPr>
-              <w:spacing w:line="360" w:lineRule="auto"/>
+            <w:tcW w:w="4962" w:type="dxa"/>
+            <w:vAlign w:val="center"/>
+          </w:tcPr>
+          <w:p>
+            <w:pPr>
               <w:rPr>
                 <w:b/>
                 <w:sz w:val="28"/>
@@ -1058,31 +861,17 @@
                 <w:sz w:val="24"/>
                 <w:szCs w:val="24"/>
               </w:rPr>
-              <w:t xml:space="preserve"> 90 Minute</w:t>
-            </w:r>
-            <w:r>
-              <w:rPr>
-                <w:sz w:val="24"/>
-                <w:szCs w:val="24"/>
-              </w:rPr>
-              <w:t>s</w:t>
-            </w:r>
-          </w:p>
-        </w:tc>
-        <w:tc>
-          <w:tcPr>
-            <w:tcW w:w="5788" w:type="dxa"/>
-            <w:tcBorders>
-              <w:top w:val="double" w:sz="4" w:space="0" w:color="auto"/>
-              <w:left w:val="double" w:sz="4" w:space="0" w:color="auto"/>
-              <w:bottom w:val="double" w:sz="4" w:space="0" w:color="auto"/>
-              <w:right w:val="double" w:sz="4" w:space="0" w:color="auto"/>
-            </w:tcBorders>
-            <w:vAlign w:val="bottom"/>
-          </w:tcPr>
-          <w:p>
-            <w:pPr>
-              <w:spacing w:line="360" w:lineRule="auto"/>
+              <w:t xml:space="preserve"> 90 Minutes</w:t>
+            </w:r>
+          </w:p>
+        </w:tc>
+        <w:tc>
+          <w:tcPr>
+            <w:tcW w:w="5789" w:type="dxa"/>
+            <w:vAlign w:val="center"/>
+          </w:tcPr>
+          <w:p>
+            <w:pPr>
               <w:rPr>
                 <w:b/>
                 <w:sz w:val="28"/>
@@ -1102,208 +891,559 @@
                 <w:sz w:val="24"/>
                 <w:szCs w:val="24"/>
               </w:rPr>
+              <w:t xml:space="preserve"> 50</w:t>
+            </w:r>
+          </w:p>
+        </w:tc>
+      </w:tr>
+    </w:tbl>
+    <w:tbl>
+      <w:tblPr>
+        <w:tblW w:w="10800" w:type="dxa"/>
+        <w:tblInd w:w="108" w:type="dxa"/>
+        <w:tblBorders>
+          <w:top w:val="thinThickSmallGap" w:sz="12" w:space="0" w:color="auto"/>
+          <w:left w:val="thinThickSmallGap" w:sz="12" w:space="0" w:color="auto"/>
+          <w:bottom w:val="thickThinSmallGap" w:sz="12" w:space="0" w:color="auto"/>
+          <w:right w:val="thickThinSmallGap" w:sz="12" w:space="0" w:color="auto"/>
+          <w:insideH w:val="single" w:sz="6" w:space="0" w:color="auto"/>
+          <w:insideV w:val="single" w:sz="6" w:space="0" w:color="auto"/>
+        </w:tblBorders>
+        <w:tblLook w:val="0000" w:firstRow="0" w:lastRow="0" w:firstColumn="0" w:lastColumn="0" w:noHBand="0" w:noVBand="0"/>
+      </w:tblPr>
+      <w:tblGrid>
+        <w:gridCol w:w="10800"/>
+      </w:tblGrid>
+      <w:tr>
+        <w:trPr>
+          <w:trHeight w:val="1085"/>
+        </w:trPr>
+        <w:tc>
+          <w:tcPr>
+            <w:tcW w:w="10800" w:type="dxa"/>
+            <w:vAlign w:val="center"/>
+          </w:tcPr>
+          <w:p>
+            <w:pPr>
+              <w:pStyle w:val="ListParagraph"/>
+              <w:ind w:left="-108" w:right="-851"/>
+              <w:rPr>
+                <w:sz w:val="21"/>
+                <w:szCs w:val="21"/>
+              </w:rPr>
+            </w:pPr>
+            <w:r>
+              <w:rPr>
+                <w:rStyle w:val="Strong"/>
+                <w:sz w:val="24"/>
+                <w:szCs w:val="21"/>
+              </w:rPr>
+              <w:t xml:space="preserve">  </w:t>
+            </w:r>
+            <w:r>
+              <w:rPr>
+                <w:rStyle w:val="Strong"/>
+                <w:sz w:val="24"/>
+                <w:szCs w:val="21"/>
+              </w:rPr>
+              <w:t xml:space="preserve">Knowledge </w:t>
+            </w:r>
+            <w:r>
+              <w:rPr>
+                <w:rStyle w:val="Strong"/>
+                <w:sz w:val="24"/>
+                <w:szCs w:val="21"/>
+              </w:rPr>
+              <w:t>Level:</w:t>
+            </w:r>
+            <w:r>
+              <w:rPr>
+                <w:b/>
+                <w:sz w:val="21"/>
+                <w:szCs w:val="21"/>
+              </w:rPr>
+              <w:t xml:space="preserve"> K</w:t>
+            </w:r>
+            <w:r>
+              <w:rPr>
+                <w:b/>
+                <w:sz w:val="21"/>
+                <w:szCs w:val="21"/>
+              </w:rPr>
+              <w:t>1–Remember</w:t>
+            </w:r>
+            <w:r>
+              <w:rPr>
+                <w:b/>
+                <w:sz w:val="21"/>
+                <w:szCs w:val="21"/>
+              </w:rPr>
+              <w:t>-</w:t>
+            </w:r>
+            <w:r>
+              <w:rPr>
+                <w:sz w:val="21"/>
+                <w:szCs w:val="21"/>
+              </w:rPr>
+              <w:t xml:space="preserve"> (</w:t>
+            </w:r>
+            <w:r>
+              <w:rPr>
+                <w:sz w:val="21"/>
+                <w:szCs w:val="21"/>
+              </w:rPr>
+              <w:t>Define, List, State, Identify, Recall, Name</w:t>
+            </w:r>
+            <w:r>
+              <w:rPr>
+                <w:sz w:val="21"/>
+                <w:szCs w:val="21"/>
+              </w:rPr>
+              <w:t>, Mention)</w:t>
+            </w:r>
+            <w:r>
+              <w:rPr>
+                <w:sz w:val="21"/>
+                <w:szCs w:val="21"/>
+              </w:rPr>
               <w:t xml:space="preserve"> </w:t>
             </w:r>
-            <w:r>
-              <w:rPr>
-                <w:sz w:val="24"/>
-                <w:szCs w:val="24"/>
-              </w:rPr>
-              <w:t>50</w:t>
-            </w:r>
-          </w:p>
-        </w:tc>
-      </w:tr>
-      <w:tr>
-        <w:tc>
-          <w:tcPr>
-            <w:tcW w:type="dxa" w:w="10859"/>
-            <w:gridSpan w:val="2"/>
-          </w:tcPr>
-          <w:p>
-            <w:pPr>
-              <w:spacing w:before="60" w:after="60" w:line="276" w:lineRule="auto"/>
-            </w:pPr>
-            <w:r/>
-            <w:r>
-              <w:rPr>
-                <w:rFonts w:ascii="Times New Roman" w:hAnsi="Times New Roman"/>
-                <w:b/>
-                <w:sz w:val="20"/>
-              </w:rPr>
-              <w:t>Knowledge Level:</w:t>
-              <w:br/>
-            </w:r>
-            <w:r>
-              <w:rPr>
-                <w:rFonts w:ascii="Times New Roman" w:hAnsi="Times New Roman"/>
-                <w:sz w:val="19"/>
-              </w:rPr>
-              <w:t xml:space="preserve">                   </w:t>
-            </w:r>
-            <w:r>
-              <w:rPr>
-                <w:rFonts w:ascii="Times New Roman" w:hAnsi="Times New Roman"/>
-                <w:b/>
-                <w:sz w:val="19"/>
-              </w:rPr>
-              <w:t>K1–Remember</w:t>
-            </w:r>
-            <w:r>
-              <w:tab/>
-            </w:r>
-            <w:r>
-              <w:rPr>
-                <w:rFonts w:ascii="Times New Roman" w:hAnsi="Times New Roman"/>
-                <w:b w:val="0"/>
-                <w:sz w:val="19"/>
-              </w:rPr>
-              <w:t>:(Define, List, State, Identify, Recall, Name, Mention);</w:t>
-            </w:r>
-            <w:r>
-              <w:br/>
-            </w:r>
-            <w:r>
-              <w:rPr>
-                <w:rFonts w:ascii="Times New Roman" w:hAnsi="Times New Roman"/>
-                <w:sz w:val="19"/>
-              </w:rPr>
-              <w:t xml:space="preserve">                   </w:t>
-            </w:r>
-            <w:r>
-              <w:rPr>
-                <w:rFonts w:ascii="Times New Roman" w:hAnsi="Times New Roman"/>
-                <w:b/>
-                <w:sz w:val="19"/>
+          </w:p>
+          <w:p>
+            <w:pPr>
+              <w:pStyle w:val="ListParagraph"/>
+              <w:ind w:left="-108" w:right="-851"/>
+              <w:rPr>
+                <w:b/>
+                <w:sz w:val="21"/>
+                <w:szCs w:val="21"/>
+              </w:rPr>
+            </w:pPr>
+            <w:r>
+              <w:rPr>
+                <w:b/>
+                <w:sz w:val="21"/>
+                <w:szCs w:val="21"/>
+              </w:rPr>
+              <w:t xml:space="preserve">                                     </w:t>
+            </w:r>
+            <w:r>
+              <w:rPr>
+                <w:b/>
+                <w:sz w:val="21"/>
+                <w:szCs w:val="21"/>
+              </w:rPr>
+              <w:t xml:space="preserve"> </w:t>
+            </w:r>
+            <w:r>
+              <w:rPr>
+                <w:b/>
+                <w:sz w:val="21"/>
+                <w:szCs w:val="21"/>
               </w:rPr>
               <w:t>K2–Understand</w:t>
             </w:r>
             <w:r>
-              <w:tab/>
-            </w:r>
-            <w:r>
-              <w:rPr>
-                <w:rFonts w:ascii="Times New Roman" w:hAnsi="Times New Roman"/>
-                <w:b w:val="0"/>
-                <w:sz w:val="19"/>
-              </w:rPr>
-              <w:t>:(Explain,  Describe, Discuss, Distinguish, illustrate);</w:t>
-            </w:r>
-            <w:r>
-              <w:br/>
-            </w:r>
-            <w:r>
-              <w:rPr>
-                <w:rFonts w:ascii="Times New Roman" w:hAnsi="Times New Roman"/>
-                <w:sz w:val="19"/>
-              </w:rPr>
-              <w:t xml:space="preserve">                   </w:t>
-            </w:r>
-            <w:r>
-              <w:rPr>
-                <w:rFonts w:ascii="Times New Roman" w:hAnsi="Times New Roman"/>
-                <w:b/>
-                <w:sz w:val="19"/>
+              <w:rPr>
+                <w:b/>
+                <w:sz w:val="21"/>
+                <w:szCs w:val="21"/>
+              </w:rPr>
+              <w:t>-</w:t>
+            </w:r>
+            <w:r>
+              <w:rPr>
+                <w:sz w:val="21"/>
+                <w:szCs w:val="21"/>
+              </w:rPr>
+              <w:t xml:space="preserve"> (</w:t>
+            </w:r>
+            <w:r>
+              <w:rPr>
+                <w:sz w:val="21"/>
+                <w:szCs w:val="21"/>
+              </w:rPr>
+              <w:t>Explain,</w:t>
+            </w:r>
+            <w:r>
+              <w:rPr>
+                <w:sz w:val="21"/>
+                <w:szCs w:val="21"/>
+              </w:rPr>
+              <w:t xml:space="preserve"> </w:t>
+            </w:r>
+            <w:r>
+              <w:rPr>
+                <w:sz w:val="21"/>
+                <w:szCs w:val="21"/>
+              </w:rPr>
+              <w:t>Describe</w:t>
+            </w:r>
+            <w:r>
+              <w:rPr>
+                <w:sz w:val="21"/>
+                <w:szCs w:val="21"/>
+              </w:rPr>
+              <w:t>,</w:t>
+            </w:r>
+            <w:r>
+              <w:rPr>
+                <w:sz w:val="21"/>
+                <w:szCs w:val="21"/>
+              </w:rPr>
+              <w:t xml:space="preserve"> Discuss, </w:t>
+            </w:r>
+            <w:r>
+              <w:rPr>
+                <w:sz w:val="21"/>
+                <w:szCs w:val="21"/>
+              </w:rPr>
+              <w:t>Distinguish, illustrate</w:t>
+            </w:r>
+            <w:r>
+              <w:rPr>
+                <w:sz w:val="21"/>
+                <w:szCs w:val="21"/>
+              </w:rPr>
+              <w:t>)</w:t>
+            </w:r>
+            <w:r>
+              <w:rPr>
+                <w:b/>
+                <w:sz w:val="21"/>
+                <w:szCs w:val="21"/>
+              </w:rPr>
+              <w:t xml:space="preserve"> </w:t>
+            </w:r>
+          </w:p>
+          <w:p>
+            <w:pPr>
+              <w:pStyle w:val="ListParagraph"/>
+              <w:ind w:left="-108" w:right="-851"/>
+              <w:rPr>
+                <w:sz w:val="21"/>
+                <w:szCs w:val="21"/>
+              </w:rPr>
+            </w:pPr>
+            <w:r>
+              <w:rPr>
+                <w:b/>
+                <w:sz w:val="21"/>
+                <w:szCs w:val="21"/>
+              </w:rPr>
+              <w:t xml:space="preserve">                                     </w:t>
+            </w:r>
+            <w:r>
+              <w:rPr>
+                <w:b/>
+                <w:sz w:val="21"/>
+                <w:szCs w:val="21"/>
+              </w:rPr>
+              <w:t xml:space="preserve"> </w:t>
+            </w:r>
+            <w:r>
+              <w:rPr>
+                <w:b/>
+                <w:sz w:val="21"/>
+                <w:szCs w:val="21"/>
               </w:rPr>
               <w:t>K3–Apply</w:t>
             </w:r>
             <w:r>
-              <w:tab/>
-            </w:r>
-            <w:r>
-              <w:rPr>
-                <w:rFonts w:ascii="Times New Roman" w:hAnsi="Times New Roman"/>
-                <w:b w:val="0"/>
-                <w:sz w:val="19"/>
-              </w:rPr>
-              <w:t>:(Compute, Calculate, Solve, Apply, Drive, Demonstrate, Determine);</w:t>
-            </w:r>
-            <w:r>
-              <w:br/>
-            </w:r>
-            <w:r>
-              <w:rPr>
-                <w:rFonts w:ascii="Times New Roman" w:hAnsi="Times New Roman"/>
-                <w:sz w:val="19"/>
-              </w:rPr>
-              <w:t xml:space="preserve">                   </w:t>
-            </w:r>
-            <w:r>
-              <w:rPr>
-                <w:rFonts w:ascii="Times New Roman" w:hAnsi="Times New Roman"/>
-                <w:b/>
-                <w:sz w:val="19"/>
+              <w:rPr>
+                <w:b/>
+                <w:sz w:val="21"/>
+                <w:szCs w:val="21"/>
+              </w:rPr>
+              <w:t>-</w:t>
+            </w:r>
+            <w:r>
+              <w:rPr>
+                <w:sz w:val="21"/>
+                <w:szCs w:val="21"/>
+              </w:rPr>
+              <w:t xml:space="preserve"> (</w:t>
+            </w:r>
+            <w:r>
+              <w:rPr>
+                <w:sz w:val="21"/>
+                <w:szCs w:val="21"/>
+              </w:rPr>
+              <w:t>C</w:t>
+            </w:r>
+            <w:r>
+              <w:rPr>
+                <w:sz w:val="21"/>
+                <w:szCs w:val="21"/>
+              </w:rPr>
+              <w:t>ompute</w:t>
+            </w:r>
+            <w:r>
+              <w:rPr>
+                <w:sz w:val="21"/>
+                <w:szCs w:val="21"/>
+              </w:rPr>
+              <w:t>,</w:t>
+            </w:r>
+            <w:r>
+              <w:rPr>
+                <w:sz w:val="21"/>
+                <w:szCs w:val="21"/>
+              </w:rPr>
+              <w:t xml:space="preserve"> Calculate, Solve, Apply,</w:t>
+            </w:r>
+            <w:r>
+              <w:rPr>
+                <w:sz w:val="21"/>
+                <w:szCs w:val="21"/>
+              </w:rPr>
+              <w:t xml:space="preserve"> Drive, </w:t>
+            </w:r>
+            <w:r>
+              <w:rPr>
+                <w:sz w:val="21"/>
+                <w:szCs w:val="21"/>
+              </w:rPr>
+              <w:t>Demonstrate, Determine</w:t>
+            </w:r>
+            <w:r>
+              <w:rPr>
+                <w:sz w:val="21"/>
+                <w:szCs w:val="21"/>
+              </w:rPr>
+              <w:t>)</w:t>
+            </w:r>
+            <w:r>
+              <w:rPr>
+                <w:sz w:val="21"/>
+                <w:szCs w:val="21"/>
+              </w:rPr>
+              <w:t xml:space="preserve"> </w:t>
+            </w:r>
+          </w:p>
+          <w:p>
+            <w:pPr>
+              <w:pStyle w:val="ListParagraph"/>
+              <w:ind w:left="-108" w:right="-851"/>
+              <w:rPr>
+                <w:sz w:val="21"/>
+                <w:szCs w:val="21"/>
+              </w:rPr>
+            </w:pPr>
+            <w:r>
+              <w:rPr>
+                <w:b/>
+                <w:sz w:val="21"/>
+                <w:szCs w:val="21"/>
+              </w:rPr>
+              <w:t xml:space="preserve">                                     </w:t>
+            </w:r>
+            <w:r>
+              <w:rPr>
+                <w:b/>
+                <w:sz w:val="21"/>
+                <w:szCs w:val="21"/>
+              </w:rPr>
+              <w:t xml:space="preserve"> </w:t>
+            </w:r>
+            <w:r>
+              <w:rPr>
+                <w:b/>
+                <w:sz w:val="21"/>
+                <w:szCs w:val="21"/>
               </w:rPr>
               <w:t>K4–Analyze</w:t>
             </w:r>
             <w:r>
-              <w:tab/>
-            </w:r>
-            <w:r>
-              <w:rPr>
-                <w:rFonts w:ascii="Times New Roman" w:hAnsi="Times New Roman"/>
-                <w:b w:val="0"/>
-                <w:sz w:val="19"/>
-              </w:rPr>
-              <w:t>:(Analyze, Differentiate, Examine, Classify, Compare, Investigate);</w:t>
-            </w:r>
-            <w:r>
-              <w:br/>
-            </w:r>
-            <w:r>
-              <w:rPr>
-                <w:rFonts w:ascii="Times New Roman" w:hAnsi="Times New Roman"/>
-                <w:sz w:val="19"/>
-              </w:rPr>
-              <w:t xml:space="preserve">                   </w:t>
-            </w:r>
-            <w:r>
-              <w:rPr>
-                <w:rFonts w:ascii="Times New Roman" w:hAnsi="Times New Roman"/>
-                <w:b/>
-                <w:sz w:val="19"/>
+              <w:rPr>
+                <w:b/>
+                <w:sz w:val="21"/>
+                <w:szCs w:val="21"/>
+              </w:rPr>
+              <w:t>-</w:t>
+            </w:r>
+            <w:r>
+              <w:rPr>
+                <w:sz w:val="21"/>
+                <w:szCs w:val="21"/>
+              </w:rPr>
+              <w:t xml:space="preserve"> (</w:t>
+            </w:r>
+            <w:r>
+              <w:rPr>
+                <w:sz w:val="21"/>
+                <w:szCs w:val="21"/>
+              </w:rPr>
+              <w:t xml:space="preserve">Analyze, </w:t>
+            </w:r>
+            <w:r>
+              <w:rPr>
+                <w:sz w:val="21"/>
+                <w:szCs w:val="21"/>
+              </w:rPr>
+              <w:t>Differentiate, Examine, Classify</w:t>
+            </w:r>
+            <w:r>
+              <w:t>,</w:t>
+            </w:r>
+            <w:r>
+              <w:rPr>
+                <w:sz w:val="21"/>
+                <w:szCs w:val="21"/>
+              </w:rPr>
+              <w:t xml:space="preserve"> Compare,</w:t>
+            </w:r>
+            <w:r>
+              <w:rPr>
+                <w:sz w:val="21"/>
+                <w:szCs w:val="21"/>
+              </w:rPr>
+              <w:t xml:space="preserve"> Investigate</w:t>
+            </w:r>
+            <w:r>
+              <w:rPr>
+                <w:sz w:val="21"/>
+                <w:szCs w:val="21"/>
+              </w:rPr>
+              <w:t>)</w:t>
+            </w:r>
+          </w:p>
+          <w:p>
+            <w:pPr>
+              <w:pStyle w:val="ListParagraph"/>
+              <w:ind w:left="-108" w:right="-851"/>
+              <w:rPr>
+                <w:sz w:val="21"/>
+                <w:szCs w:val="21"/>
+              </w:rPr>
+            </w:pPr>
+            <w:r>
+              <w:rPr>
+                <w:sz w:val="21"/>
+                <w:szCs w:val="21"/>
+              </w:rPr>
+              <w:t xml:space="preserve"> </w:t>
+            </w:r>
+            <w:r>
+              <w:rPr>
+                <w:sz w:val="21"/>
+                <w:szCs w:val="21"/>
+              </w:rPr>
+              <w:t xml:space="preserve">                                    </w:t>
+            </w:r>
+            <w:r>
+              <w:rPr>
+                <w:sz w:val="21"/>
+                <w:szCs w:val="21"/>
+              </w:rPr>
+              <w:t xml:space="preserve"> </w:t>
+            </w:r>
+            <w:r>
+              <w:rPr>
+                <w:b/>
+                <w:sz w:val="21"/>
+                <w:szCs w:val="21"/>
               </w:rPr>
               <w:t>K5–Evaluate</w:t>
             </w:r>
             <w:r>
-              <w:tab/>
-            </w:r>
-            <w:r>
-              <w:rPr>
-                <w:rFonts w:ascii="Times New Roman" w:hAnsi="Times New Roman"/>
-                <w:b w:val="0"/>
-                <w:sz w:val="19"/>
-              </w:rPr>
-              <w:t>:(Justify, Evaluate, Assess, Critique, Validate);</w:t>
-            </w:r>
-            <w:r>
-              <w:br/>
-            </w:r>
-            <w:r>
-              <w:rPr>
-                <w:rFonts w:ascii="Times New Roman" w:hAnsi="Times New Roman"/>
-                <w:sz w:val="19"/>
-              </w:rPr>
-              <w:t xml:space="preserve">                   </w:t>
-            </w:r>
-            <w:r>
-              <w:rPr>
-                <w:rFonts w:ascii="Times New Roman" w:hAnsi="Times New Roman"/>
-                <w:b/>
-                <w:sz w:val="19"/>
+              <w:rPr>
+                <w:b/>
+                <w:sz w:val="21"/>
+                <w:szCs w:val="21"/>
+              </w:rPr>
+              <w:t>-</w:t>
+            </w:r>
+            <w:r>
+              <w:rPr>
+                <w:sz w:val="21"/>
+                <w:szCs w:val="21"/>
+              </w:rPr>
+              <w:t xml:space="preserve"> (</w:t>
+            </w:r>
+            <w:r>
+              <w:rPr>
+                <w:sz w:val="21"/>
+                <w:szCs w:val="21"/>
+              </w:rPr>
+              <w:t>Justify, Evaluate, Assess, Critique, Validate</w:t>
+            </w:r>
+            <w:r>
+              <w:rPr>
+                <w:sz w:val="21"/>
+                <w:szCs w:val="21"/>
+              </w:rPr>
+              <w:t>)</w:t>
+            </w:r>
+          </w:p>
+          <w:p>
+            <w:pPr>
+              <w:pStyle w:val="ListParagraph"/>
+              <w:ind w:left="-108" w:right="-851"/>
+              <w:rPr>
+                <w:b/>
+              </w:rPr>
+            </w:pPr>
+            <w:r>
+              <w:rPr>
+                <w:b/>
+                <w:sz w:val="21"/>
+                <w:szCs w:val="21"/>
+              </w:rPr>
+              <w:t xml:space="preserve"> </w:t>
+            </w:r>
+            <w:r>
+              <w:rPr>
+                <w:b/>
+                <w:sz w:val="21"/>
+                <w:szCs w:val="21"/>
+              </w:rPr>
+              <w:t xml:space="preserve">                                    </w:t>
+            </w:r>
+            <w:r>
+              <w:rPr>
+                <w:b/>
+                <w:sz w:val="21"/>
+                <w:szCs w:val="21"/>
+              </w:rPr>
+              <w:t xml:space="preserve"> </w:t>
+            </w:r>
+            <w:r>
+              <w:rPr>
+                <w:b/>
+                <w:sz w:val="21"/>
+                <w:szCs w:val="21"/>
               </w:rPr>
               <w:t>K6–Create</w:t>
             </w:r>
             <w:r>
-              <w:tab/>
-            </w:r>
-            <w:r>
-              <w:rPr>
-                <w:rFonts w:ascii="Times New Roman" w:hAnsi="Times New Roman"/>
-                <w:b w:val="0"/>
-                <w:sz w:val="19"/>
-              </w:rPr>
-              <w:t>:( Design, Develop, Construct, Formulate, Propose).</w:t>
+              <w:rPr>
+                <w:b/>
+                <w:sz w:val="21"/>
+                <w:szCs w:val="21"/>
+              </w:rPr>
+              <w:t>-</w:t>
+            </w:r>
+            <w:r>
+              <w:rPr>
+                <w:sz w:val="21"/>
+                <w:szCs w:val="21"/>
+              </w:rPr>
+              <w:t xml:space="preserve"> (</w:t>
+            </w:r>
+            <w:r>
+              <w:rPr>
+                <w:sz w:val="21"/>
+                <w:szCs w:val="21"/>
+              </w:rPr>
+              <w:t>Design,</w:t>
+            </w:r>
+            <w:r>
+              <w:rPr>
+                <w:sz w:val="21"/>
+                <w:szCs w:val="21"/>
+              </w:rPr>
+              <w:t xml:space="preserve"> Develop, Construct, Formulate, Propose)</w:t>
             </w:r>
           </w:p>
         </w:tc>
@@ -1319,12 +1459,6 @@
         <w:ind w:left="144" w:right="1477"/>
         <w:jc w:val="center"/>
       </w:pPr>
-      <w:r>
-        <w:t xml:space="preserve">             </w:t>
-      </w:r>
-      <w:r>
-        <w:t xml:space="preserve">     </w:t>
-      </w:r>
     </w:p>
     <w:p>
       <w:pPr>
@@ -1344,26 +1478,26 @@
       </w:r>
       <w:r>
         <w:rPr>
-          <w:shd w:val="clear" w:color="auto" w:fill="BFBFBF" w:themeFill="background1" w:themeFillShade="BF"/>
+          <w:shd w:val="clear" w:color="auto" w:fill="000000" w:themeFill="background1" w:themeFillShade="BF"/>
         </w:rPr>
         <w:t>PART–A (5 x 2=1</w:t>
       </w:r>
       <w:r>
         <w:rPr>
-          <w:shd w:val="clear" w:color="auto" w:fill="BFBFBF" w:themeFill="background1" w:themeFillShade="BF"/>
+          <w:shd w:val="clear" w:color="auto" w:fill="000000" w:themeFill="background1" w:themeFillShade="BF"/>
         </w:rPr>
         <w:t>0</w:t>
       </w:r>
       <w:r>
         <w:rPr>
-          <w:shd w:val="clear" w:color="auto" w:fill="BFBFBF" w:themeFill="background1" w:themeFillShade="BF"/>
+          <w:shd w:val="clear" w:color="auto" w:fill="000000" w:themeFill="background1" w:themeFillShade="BF"/>
         </w:rPr>
         <w:t xml:space="preserve"> </w:t>
       </w:r>
       <w:r>
         <w:rPr>
           <w:spacing w:val="-2"/>
-          <w:shd w:val="clear" w:color="auto" w:fill="BFBFBF" w:themeFill="background1" w:themeFillShade="BF"/>
+          <w:shd w:val="clear" w:color="auto" w:fill="000000" w:themeFill="background1" w:themeFillShade="BF"/>
         </w:rPr>
         <w:t>Marks)</w:t>
       </w:r>
@@ -1454,7 +1588,6 @@
               </w:rPr>
             </w:pPr>
             <w:proofErr w:type="spellStart"/>
-            <w:proofErr w:type="gramStart"/>
             <w:r>
               <w:rPr>
                 <w:b/>
@@ -1464,7 +1597,6 @@
               <w:t>Q.No</w:t>
             </w:r>
             <w:proofErr w:type="spellEnd"/>
-            <w:proofErr w:type="gramEnd"/>
           </w:p>
           <w:p>
             <w:pPr>
@@ -1669,20 +1801,15 @@
           </w:tcPr>
           <w:p>
             <w:pPr>
-              <w:pStyle w:val="TableParagraph"/>
-              <w:spacing w:before="1" w:line="254" w:lineRule="exact"/>
-              <w:ind w:left="2" w:right="4"/>
-              <w:rPr>
-                <w:sz w:val="24"/>
-                <w:szCs w:val="24"/>
-              </w:rPr>
-            </w:pPr>
-            <w:r>
-              <w:rPr>
-                <w:sz w:val="24"/>
-                <w:szCs w:val="24"/>
-              </w:rPr>
-              <w:t>CO1</w:t>
+              <w:jc w:val="center"/>
+            </w:pPr>
+            <w:r/>
+            <w:r>
+              <w:rPr>
+                <w:rFonts w:ascii="Times New Roman" w:hAnsi="Times New Roman"/>
+                <w:sz w:val="24"/>
+              </w:rPr>
+              <w:t>CO2</w:t>
             </w:r>
           </w:p>
         </w:tc>
@@ -1753,20 +1880,15 @@
           </w:tcPr>
           <w:p>
             <w:pPr>
-              <w:pStyle w:val="TableParagraph"/>
-              <w:spacing w:before="1" w:line="254" w:lineRule="exact"/>
-              <w:ind w:left="2" w:right="4"/>
-              <w:rPr>
-                <w:sz w:val="24"/>
-                <w:szCs w:val="24"/>
-              </w:rPr>
-            </w:pPr>
-            <w:r>
-              <w:rPr>
-                <w:sz w:val="24"/>
-                <w:szCs w:val="24"/>
-              </w:rPr>
-              <w:t>CO1</w:t>
+              <w:jc w:val="center"/>
+            </w:pPr>
+            <w:r/>
+            <w:r>
+              <w:rPr>
+                <w:rFonts w:ascii="Times New Roman" w:hAnsi="Times New Roman"/>
+                <w:sz w:val="24"/>
+              </w:rPr>
+              <w:t>CO2</w:t>
             </w:r>
           </w:p>
         </w:tc>
@@ -1837,20 +1959,15 @@
           </w:tcPr>
           <w:p>
             <w:pPr>
-              <w:pStyle w:val="TableParagraph"/>
-              <w:spacing w:before="46"/>
-              <w:ind w:left="2" w:right="4"/>
-              <w:rPr>
-                <w:sz w:val="24"/>
-                <w:szCs w:val="24"/>
-              </w:rPr>
-            </w:pPr>
-            <w:r>
-              <w:rPr>
-                <w:sz w:val="24"/>
-                <w:szCs w:val="24"/>
-              </w:rPr>
-              <w:t>CO1</w:t>
+              <w:jc w:val="center"/>
+            </w:pPr>
+            <w:r/>
+            <w:r>
+              <w:rPr>
+                <w:rFonts w:ascii="Times New Roman" w:hAnsi="Times New Roman"/>
+                <w:sz w:val="24"/>
+              </w:rPr>
+              <w:t>CO3</w:t>
             </w:r>
           </w:p>
         </w:tc>
@@ -1919,20 +2036,15 @@
           </w:tcPr>
           <w:p>
             <w:pPr>
-              <w:pStyle w:val="TableParagraph"/>
-              <w:spacing w:before="1" w:line="259" w:lineRule="exact"/>
-              <w:ind w:left="2" w:right="4"/>
-              <w:rPr>
-                <w:sz w:val="24"/>
-                <w:szCs w:val="24"/>
-              </w:rPr>
-            </w:pPr>
-            <w:r>
-              <w:rPr>
-                <w:sz w:val="24"/>
-                <w:szCs w:val="24"/>
-              </w:rPr>
-              <w:t>CO2</w:t>
+              <w:jc w:val="center"/>
+            </w:pPr>
+            <w:r/>
+            <w:r>
+              <w:rPr>
+                <w:rFonts w:ascii="Times New Roman" w:hAnsi="Times New Roman"/>
+                <w:sz w:val="24"/>
+              </w:rPr>
+              <w:t>CO3</w:t>
             </w:r>
           </w:p>
         </w:tc>
@@ -2001,20 +2113,15 @@
           </w:tcPr>
           <w:p>
             <w:pPr>
-              <w:pStyle w:val="TableParagraph"/>
-              <w:spacing w:before="1" w:line="254" w:lineRule="exact"/>
-              <w:ind w:left="2" w:right="4"/>
-              <w:rPr>
-                <w:sz w:val="24"/>
-                <w:szCs w:val="24"/>
-              </w:rPr>
-            </w:pPr>
-            <w:r>
-              <w:rPr>
-                <w:sz w:val="24"/>
-                <w:szCs w:val="24"/>
-              </w:rPr>
-              <w:t>CO2</w:t>
+              <w:jc w:val="center"/>
+            </w:pPr>
+            <w:r/>
+            <w:r>
+              <w:rPr>
+                <w:rFonts w:ascii="Times New Roman" w:hAnsi="Times New Roman"/>
+                <w:sz w:val="24"/>
+              </w:rPr>
+              <w:t>CO3</w:t>
             </w:r>
           </w:p>
         </w:tc>
@@ -2052,7 +2159,7 @@
           <w:spacing w:val="-2"/>
           <w:sz w:val="24"/>
           <w:szCs w:val="24"/>
-          <w:shd w:val="clear" w:color="auto" w:fill="BFBFBF" w:themeFill="background1" w:themeFillShade="BF"/>
+          <w:shd w:val="clear" w:color="auto" w:fill="000000" w:themeFill="background1" w:themeFillShade="BF"/>
         </w:rPr>
       </w:pPr>
       <w:r>
@@ -2094,7 +2201,7 @@
         <w:rPr>
           <w:sz w:val="24"/>
           <w:szCs w:val="24"/>
-          <w:shd w:val="clear" w:color="auto" w:fill="BFBFBF" w:themeFill="background1" w:themeFillShade="BF"/>
+          <w:shd w:val="clear" w:color="auto" w:fill="000000" w:themeFill="background1" w:themeFillShade="BF"/>
         </w:rPr>
         <w:t xml:space="preserve">PART–B </w:t>
       </w:r>
@@ -2102,7 +2209,7 @@
         <w:rPr>
           <w:sz w:val="24"/>
           <w:szCs w:val="24"/>
-          <w:shd w:val="clear" w:color="auto" w:fill="BFBFBF" w:themeFill="background1" w:themeFillShade="BF"/>
+          <w:shd w:val="clear" w:color="auto" w:fill="000000" w:themeFill="background1" w:themeFillShade="BF"/>
         </w:rPr>
         <w:t>(2</w:t>
       </w:r>
@@ -2110,7 +2217,7 @@
         <w:rPr>
           <w:sz w:val="24"/>
           <w:szCs w:val="24"/>
-          <w:shd w:val="clear" w:color="auto" w:fill="BFBFBF" w:themeFill="background1" w:themeFillShade="BF"/>
+          <w:shd w:val="clear" w:color="auto" w:fill="000000" w:themeFill="background1" w:themeFillShade="BF"/>
         </w:rPr>
         <w:t xml:space="preserve"> </w:t>
       </w:r>
@@ -2118,7 +2225,7 @@
         <w:rPr>
           <w:sz w:val="24"/>
           <w:szCs w:val="24"/>
-          <w:shd w:val="clear" w:color="auto" w:fill="BFBFBF" w:themeFill="background1" w:themeFillShade="BF"/>
+          <w:shd w:val="clear" w:color="auto" w:fill="000000" w:themeFill="background1" w:themeFillShade="BF"/>
         </w:rPr>
         <w:t>x 13</w:t>
       </w:r>
@@ -2126,7 +2233,7 @@
         <w:rPr>
           <w:sz w:val="24"/>
           <w:szCs w:val="24"/>
-          <w:shd w:val="clear" w:color="auto" w:fill="BFBFBF" w:themeFill="background1" w:themeFillShade="BF"/>
+          <w:shd w:val="clear" w:color="auto" w:fill="000000" w:themeFill="background1" w:themeFillShade="BF"/>
         </w:rPr>
         <w:t xml:space="preserve"> =</w:t>
       </w:r>
@@ -2134,7 +2241,7 @@
         <w:rPr>
           <w:sz w:val="24"/>
           <w:szCs w:val="24"/>
-          <w:shd w:val="clear" w:color="auto" w:fill="BFBFBF" w:themeFill="background1" w:themeFillShade="BF"/>
+          <w:shd w:val="clear" w:color="auto" w:fill="000000" w:themeFill="background1" w:themeFillShade="BF"/>
         </w:rPr>
         <w:t>26</w:t>
       </w:r>
@@ -2142,7 +2249,7 @@
         <w:rPr>
           <w:sz w:val="24"/>
           <w:szCs w:val="24"/>
-          <w:shd w:val="clear" w:color="auto" w:fill="BFBFBF" w:themeFill="background1" w:themeFillShade="BF"/>
+          <w:shd w:val="clear" w:color="auto" w:fill="000000" w:themeFill="background1" w:themeFillShade="BF"/>
         </w:rPr>
         <w:t xml:space="preserve"> </w:t>
       </w:r>
@@ -2151,7 +2258,7 @@
           <w:spacing w:val="-2"/>
           <w:sz w:val="24"/>
           <w:szCs w:val="24"/>
-          <w:shd w:val="clear" w:color="auto" w:fill="BFBFBF" w:themeFill="background1" w:themeFillShade="BF"/>
+          <w:shd w:val="clear" w:color="auto" w:fill="000000" w:themeFill="background1" w:themeFillShade="BF"/>
         </w:rPr>
         <w:t>Marks)</w:t>
       </w:r>
@@ -2222,7 +2329,6 @@
               </w:rPr>
             </w:pPr>
             <w:proofErr w:type="spellStart"/>
-            <w:proofErr w:type="gramStart"/>
             <w:r>
               <w:rPr>
                 <w:b/>
@@ -2233,7 +2339,6 @@
               <w:t>Q.No</w:t>
             </w:r>
             <w:proofErr w:type="spellEnd"/>
-            <w:proofErr w:type="gramEnd"/>
           </w:p>
         </w:tc>
         <w:tc>
@@ -2461,21 +2566,15 @@
           </w:tcPr>
           <w:p>
             <w:pPr>
-              <w:pStyle w:val="TableParagraph"/>
-              <w:spacing w:before="1" w:line="254" w:lineRule="exact"/>
-              <w:ind w:left="9" w:right="7"/>
-              <w:rPr>
-                <w:sz w:val="24"/>
-                <w:szCs w:val="24"/>
-              </w:rPr>
-            </w:pPr>
-            <w:r>
-              <w:rPr>
-                <w:spacing w:val="-5"/>
-                <w:sz w:val="24"/>
-                <w:szCs w:val="24"/>
-              </w:rPr>
-              <w:t>CO1</w:t>
+              <w:jc w:val="center"/>
+            </w:pPr>
+            <w:r/>
+            <w:r>
+              <w:rPr>
+                <w:rFonts w:ascii="Times New Roman" w:hAnsi="Times New Roman"/>
+                <w:sz w:val="24"/>
+              </w:rPr>
+              <w:t>CO2</w:t>
             </w:r>
           </w:p>
         </w:tc>
@@ -2643,21 +2742,15 @@
           </w:tcPr>
           <w:p>
             <w:pPr>
-              <w:pStyle w:val="TableParagraph"/>
-              <w:spacing w:before="176"/>
-              <w:ind w:left="9" w:right="7"/>
-              <w:rPr>
-                <w:sz w:val="24"/>
-                <w:szCs w:val="24"/>
-              </w:rPr>
-            </w:pPr>
-            <w:r>
-              <w:rPr>
-                <w:spacing w:val="-5"/>
-                <w:sz w:val="24"/>
-                <w:szCs w:val="24"/>
-              </w:rPr>
-              <w:t>CO1</w:t>
+              <w:jc w:val="center"/>
+            </w:pPr>
+            <w:r/>
+            <w:r>
+              <w:rPr>
+                <w:rFonts w:ascii="Times New Roman" w:hAnsi="Times New Roman"/>
+                <w:sz w:val="24"/>
+              </w:rPr>
+              <w:t>CO2</w:t>
             </w:r>
           </w:p>
         </w:tc>
@@ -2761,29 +2854,15 @@
           </w:tcPr>
           <w:p>
             <w:pPr>
-              <w:pStyle w:val="TableParagraph"/>
-              <w:spacing w:before="76"/>
-              <w:ind w:left="9" w:right="7"/>
-              <w:rPr>
-                <w:sz w:val="24"/>
-                <w:szCs w:val="24"/>
-              </w:rPr>
-            </w:pPr>
-            <w:r>
-              <w:rPr>
-                <w:spacing w:val="-5"/>
-                <w:sz w:val="24"/>
-                <w:szCs w:val="24"/>
-              </w:rPr>
-              <w:t>CO</w:t>
-            </w:r>
-            <w:r>
-              <w:rPr>
-                <w:spacing w:val="-5"/>
-                <w:sz w:val="24"/>
-                <w:szCs w:val="24"/>
-              </w:rPr>
-              <w:t>2</w:t>
+              <w:jc w:val="center"/>
+            </w:pPr>
+            <w:r/>
+            <w:r>
+              <w:rPr>
+                <w:rFonts w:ascii="Times New Roman" w:hAnsi="Times New Roman"/>
+                <w:sz w:val="24"/>
+              </w:rPr>
+              <w:t>CO3</w:t>
             </w:r>
           </w:p>
         </w:tc>
@@ -2948,21 +3027,15 @@
           </w:tcPr>
           <w:p>
             <w:pPr>
-              <w:pStyle w:val="TableParagraph"/>
-              <w:spacing w:before="1" w:line="254" w:lineRule="exact"/>
-              <w:ind w:left="9" w:right="7"/>
-              <w:rPr>
-                <w:sz w:val="24"/>
-                <w:szCs w:val="24"/>
-              </w:rPr>
-            </w:pPr>
-            <w:r>
-              <w:rPr>
-                <w:spacing w:val="-5"/>
-                <w:sz w:val="24"/>
-                <w:szCs w:val="24"/>
-              </w:rPr>
-              <w:t>CO2</w:t>
+              <w:jc w:val="center"/>
+            </w:pPr>
+            <w:r/>
+            <w:r>
+              <w:rPr>
+                <w:rFonts w:ascii="Times New Roman" w:hAnsi="Times New Roman"/>
+                <w:sz w:val="24"/>
+              </w:rPr>
+              <w:t>CO3</w:t>
             </w:r>
           </w:p>
         </w:tc>
@@ -2988,6 +3061,7 @@
         <w:rPr>
           <w:sz w:val="28"/>
         </w:rPr>
+        <w:lastRenderedPageBreak/>
         <w:t xml:space="preserve">                                                 </w:t>
       </w:r>
       <w:r>
@@ -3074,7 +3148,6 @@
               </w:rPr>
             </w:pPr>
             <w:proofErr w:type="spellStart"/>
-            <w:proofErr w:type="gramStart"/>
             <w:r>
               <w:rPr>
                 <w:b/>
@@ -3085,7 +3158,6 @@
               <w:t>Q.No</w:t>
             </w:r>
             <w:proofErr w:type="spellEnd"/>
-            <w:proofErr w:type="gramEnd"/>
           </w:p>
         </w:tc>
         <w:tc>
@@ -3280,21 +3352,15 @@
           </w:tcPr>
           <w:p>
             <w:pPr>
-              <w:pStyle w:val="TableParagraph"/>
-              <w:spacing w:before="1" w:line="254" w:lineRule="exact"/>
-              <w:ind w:left="9" w:right="7"/>
-              <w:rPr>
-                <w:sz w:val="24"/>
-                <w:szCs w:val="24"/>
-              </w:rPr>
-            </w:pPr>
-            <w:r>
-              <w:rPr>
-                <w:spacing w:val="-5"/>
-                <w:sz w:val="24"/>
-                <w:szCs w:val="24"/>
-              </w:rPr>
-              <w:t>CO1</w:t>
+              <w:jc w:val="center"/>
+            </w:pPr>
+            <w:r/>
+            <w:r>
+              <w:rPr>
+                <w:rFonts w:ascii="Times New Roman" w:hAnsi="Times New Roman"/>
+                <w:sz w:val="24"/>
+              </w:rPr>
+              <w:t>CO2</w:t>
             </w:r>
           </w:p>
         </w:tc>
@@ -3462,21 +3528,15 @@
           </w:tcPr>
           <w:p>
             <w:pPr>
-              <w:pStyle w:val="TableParagraph"/>
-              <w:spacing w:before="176"/>
-              <w:ind w:right="7"/>
-              <w:rPr>
-                <w:sz w:val="24"/>
-                <w:szCs w:val="24"/>
-              </w:rPr>
-            </w:pPr>
-            <w:r>
-              <w:rPr>
-                <w:spacing w:val="-5"/>
-                <w:sz w:val="24"/>
-                <w:szCs w:val="24"/>
-              </w:rPr>
-              <w:t>CO2</w:t>
+              <w:jc w:val="center"/>
+            </w:pPr>
+            <w:r/>
+            <w:r>
+              <w:rPr>
+                <w:rFonts w:ascii="Times New Roman" w:hAnsi="Times New Roman"/>
+                <w:sz w:val="24"/>
+              </w:rPr>
+              <w:t>CO3</w:t>
             </w:r>
           </w:p>
         </w:tc>
@@ -3751,7 +3811,7 @@
             <w:tcBorders>
               <w:right w:val="single" w:sz="4" w:space="0" w:color="auto"/>
             </w:tcBorders>
-            <w:shd w:val="clear" w:color="auto" w:fill="BFBFBF" w:themeFill="background1" w:themeFillShade="BF"/>
+            <w:shd w:val="clear" w:color="auto" w:fill="000000" w:themeFill="background1" w:themeFillShade="BF"/>
             <w:vAlign w:val="center"/>
           </w:tcPr>
           <w:p>
@@ -3784,7 +3844,7 @@
             <w:tcBorders>
               <w:left w:val="single" w:sz="4" w:space="0" w:color="auto"/>
             </w:tcBorders>
-            <w:shd w:val="clear" w:color="auto" w:fill="BFBFBF" w:themeFill="background1" w:themeFillShade="BF"/>
+            <w:shd w:val="clear" w:color="auto" w:fill="000000" w:themeFill="background1" w:themeFillShade="BF"/>
             <w:vAlign w:val="center"/>
           </w:tcPr>
           <w:p>
@@ -3956,7 +4016,7 @@
         <w:tc>
           <w:tcPr>
             <w:tcW w:w="1062" w:type="dxa"/>
-            <w:shd w:val="clear" w:color="auto" w:fill="BFBFBF" w:themeFill="background1" w:themeFillShade="BF"/>
+            <w:shd w:val="clear" w:color="auto" w:fill="000000" w:themeFill="background1" w:themeFillShade="BF"/>
           </w:tcPr>
           <w:p>
             <w:pPr>
@@ -4004,7 +4064,7 @@
         <w:tc>
           <w:tcPr>
             <w:tcW w:w="1260" w:type="dxa"/>
-            <w:shd w:val="clear" w:color="auto" w:fill="BFBFBF" w:themeFill="background1" w:themeFillShade="BF"/>
+            <w:shd w:val="clear" w:color="auto" w:fill="000000" w:themeFill="background1" w:themeFillShade="BF"/>
           </w:tcPr>
           <w:p>
             <w:pPr>
@@ -4052,7 +4112,7 @@
         <w:tc>
           <w:tcPr>
             <w:tcW w:w="1260" w:type="dxa"/>
-            <w:shd w:val="clear" w:color="auto" w:fill="BFBFBF" w:themeFill="background1" w:themeFillShade="BF"/>
+            <w:shd w:val="clear" w:color="auto" w:fill="000000" w:themeFill="background1" w:themeFillShade="BF"/>
           </w:tcPr>
           <w:p>
             <w:pPr>
@@ -4100,7 +4160,7 @@
         <w:tc>
           <w:tcPr>
             <w:tcW w:w="1096" w:type="dxa"/>
-            <w:shd w:val="clear" w:color="auto" w:fill="BFBFBF" w:themeFill="background1" w:themeFillShade="BF"/>
+            <w:shd w:val="clear" w:color="auto" w:fill="000000" w:themeFill="background1" w:themeFillShade="BF"/>
           </w:tcPr>
           <w:p>
             <w:pPr>
@@ -4174,22 +4234,15 @@
           </w:tcPr>
           <w:p>
             <w:pPr>
-              <w:pStyle w:val="TableParagraph"/>
-              <w:ind w:left="9" w:right="5"/>
-              <w:rPr>
-                <w:b/>
-                <w:sz w:val="24"/>
-                <w:szCs w:val="24"/>
-              </w:rPr>
-            </w:pPr>
-            <w:r>
-              <w:rPr>
-                <w:b/>
-                <w:spacing w:val="-10"/>
-                <w:sz w:val="24"/>
-                <w:szCs w:val="24"/>
-              </w:rPr>
-              <w:t>I</w:t>
+              <w:jc w:val="center"/>
+            </w:pPr>
+            <w:r/>
+            <w:r>
+              <w:rPr>
+                <w:rFonts w:ascii="Times New Roman" w:hAnsi="Times New Roman"/>
+                <w:sz w:val="22"/>
+              </w:rPr>
+              <w:t>II</w:t>
             </w:r>
           </w:p>
         </w:tc>
@@ -4304,23 +4357,15 @@
           </w:tcPr>
           <w:p>
             <w:pPr>
-              <w:pStyle w:val="TableParagraph"/>
-              <w:ind w:left="9" w:right="5"/>
-              <w:rPr>
-                <w:b/>
-                <w:spacing w:val="-10"/>
-                <w:sz w:val="24"/>
-                <w:szCs w:val="24"/>
-              </w:rPr>
-            </w:pPr>
-            <w:r>
-              <w:rPr>
-                <w:b/>
-                <w:spacing w:val="-10"/>
-                <w:sz w:val="24"/>
-                <w:szCs w:val="24"/>
-              </w:rPr>
-              <w:t>II</w:t>
+              <w:jc w:val="center"/>
+            </w:pPr>
+            <w:r/>
+            <w:r>
+              <w:rPr>
+                <w:rFonts w:ascii="Times New Roman" w:hAnsi="Times New Roman"/>
+                <w:sz w:val="22"/>
+              </w:rPr>
+              <w:t>III</w:t>
             </w:r>
           </w:p>
         </w:tc>
@@ -4825,7 +4870,7 @@
             <w:tcBorders>
               <w:right w:val="single" w:sz="4" w:space="0" w:color="auto"/>
             </w:tcBorders>
-            <w:shd w:val="clear" w:color="auto" w:fill="BFBFBF" w:themeFill="background1" w:themeFillShade="BF"/>
+            <w:shd w:val="clear" w:color="auto" w:fill="000000" w:themeFill="background1" w:themeFillShade="BF"/>
             <w:vAlign w:val="center"/>
           </w:tcPr>
           <w:p>
@@ -4858,7 +4903,7 @@
             <w:tcBorders>
               <w:left w:val="single" w:sz="4" w:space="0" w:color="auto"/>
             </w:tcBorders>
-            <w:shd w:val="clear" w:color="auto" w:fill="BFBFBF" w:themeFill="background1" w:themeFillShade="BF"/>
+            <w:shd w:val="clear" w:color="auto" w:fill="000000" w:themeFill="background1" w:themeFillShade="BF"/>
             <w:vAlign w:val="center"/>
           </w:tcPr>
           <w:p>
@@ -5026,7 +5071,7 @@
         <w:tc>
           <w:tcPr>
             <w:tcW w:w="1134" w:type="dxa"/>
-            <w:shd w:val="clear" w:color="auto" w:fill="BFBFBF" w:themeFill="background1" w:themeFillShade="BF"/>
+            <w:shd w:val="clear" w:color="auto" w:fill="000000" w:themeFill="background1" w:themeFillShade="BF"/>
           </w:tcPr>
           <w:p>
             <w:pPr>
@@ -5072,7 +5117,7 @@
         <w:tc>
           <w:tcPr>
             <w:tcW w:w="1134" w:type="dxa"/>
-            <w:shd w:val="clear" w:color="auto" w:fill="BFBFBF" w:themeFill="background1" w:themeFillShade="BF"/>
+            <w:shd w:val="clear" w:color="auto" w:fill="000000" w:themeFill="background1" w:themeFillShade="BF"/>
           </w:tcPr>
           <w:p>
             <w:pPr>
@@ -5118,7 +5163,7 @@
         <w:tc>
           <w:tcPr>
             <w:tcW w:w="1276" w:type="dxa"/>
-            <w:shd w:val="clear" w:color="auto" w:fill="BFBFBF" w:themeFill="background1" w:themeFillShade="BF"/>
+            <w:shd w:val="clear" w:color="auto" w:fill="000000" w:themeFill="background1" w:themeFillShade="BF"/>
           </w:tcPr>
           <w:p>
             <w:pPr>
@@ -5164,7 +5209,7 @@
         <w:tc>
           <w:tcPr>
             <w:tcW w:w="1137" w:type="dxa"/>
-            <w:shd w:val="clear" w:color="auto" w:fill="BFBFBF" w:themeFill="background1" w:themeFillShade="BF"/>
+            <w:shd w:val="clear" w:color="auto" w:fill="000000" w:themeFill="background1" w:themeFillShade="BF"/>
           </w:tcPr>
           <w:p>
             <w:pPr>
@@ -5236,22 +5281,15 @@
           </w:tcPr>
           <w:p>
             <w:pPr>
-              <w:pStyle w:val="TableParagraph"/>
-              <w:ind w:left="9" w:right="5"/>
-              <w:rPr>
-                <w:b/>
-                <w:sz w:val="24"/>
-                <w:szCs w:val="24"/>
-              </w:rPr>
-            </w:pPr>
-            <w:r>
-              <w:rPr>
-                <w:b/>
-                <w:spacing w:val="-10"/>
-                <w:sz w:val="24"/>
-                <w:szCs w:val="24"/>
-              </w:rPr>
-              <w:t>I</w:t>
+              <w:jc w:val="center"/>
+            </w:pPr>
+            <w:r/>
+            <w:r>
+              <w:rPr>
+                <w:rFonts w:ascii="Times New Roman" w:hAnsi="Times New Roman"/>
+                <w:sz w:val="22"/>
+              </w:rPr>
+              <w:t>II</w:t>
             </w:r>
           </w:p>
         </w:tc>
@@ -5365,23 +5403,15 @@
           </w:tcPr>
           <w:p>
             <w:pPr>
-              <w:pStyle w:val="TableParagraph"/>
-              <w:ind w:left="9" w:right="5"/>
-              <w:rPr>
-                <w:b/>
-                <w:spacing w:val="-10"/>
-                <w:sz w:val="24"/>
-                <w:szCs w:val="24"/>
-              </w:rPr>
-            </w:pPr>
-            <w:r>
-              <w:rPr>
-                <w:b/>
-                <w:spacing w:val="-10"/>
-                <w:sz w:val="24"/>
-                <w:szCs w:val="24"/>
-              </w:rPr>
-              <w:t>II</w:t>
+              <w:jc w:val="center"/>
+            </w:pPr>
+            <w:r/>
+            <w:r>
+              <w:rPr>
+                <w:rFonts w:ascii="Times New Roman" w:hAnsi="Times New Roman"/>
+                <w:sz w:val="22"/>
+              </w:rPr>
+              <w:t>III</w:t>
             </w:r>
           </w:p>
         </w:tc>
@@ -6670,12 +6700,12 @@
     </w:pPr>
     <w:tblPr>
       <w:tblBorders>
-        <w:top w:val="single" w:sz="4" w:space="0" w:color="000000" w:themeColor="text1"/>
-        <w:left w:val="single" w:sz="4" w:space="0" w:color="000000" w:themeColor="text1"/>
-        <w:bottom w:val="single" w:sz="4" w:space="0" w:color="000000" w:themeColor="text1"/>
-        <w:right w:val="single" w:sz="4" w:space="0" w:color="000000" w:themeColor="text1"/>
-        <w:insideH w:val="single" w:sz="4" w:space="0" w:color="000000" w:themeColor="text1"/>
-        <w:insideV w:val="single" w:sz="4" w:space="0" w:color="000000" w:themeColor="text1"/>
+        <w:top w:val="single" w:sz="4" w:space="0" w:color="FFFFFF" w:themeColor="text1"/>
+        <w:left w:val="single" w:sz="4" w:space="0" w:color="FFFFFF" w:themeColor="text1"/>
+        <w:bottom w:val="single" w:sz="4" w:space="0" w:color="FFFFFF" w:themeColor="text1"/>
+        <w:right w:val="single" w:sz="4" w:space="0" w:color="FFFFFF" w:themeColor="text1"/>
+        <w:insideH w:val="single" w:sz="4" w:space="0" w:color="FFFFFF" w:themeColor="text1"/>
+        <w:insideV w:val="single" w:sz="4" w:space="0" w:color="FFFFFF" w:themeColor="text1"/>
       </w:tblBorders>
     </w:tblPr>
   </w:style>
@@ -6746,6 +6776,17 @@
       <w:bCs/>
     </w:rPr>
   </w:style>
+  <w:style w:type="paragraph" w:styleId="ListParagraph">
+    <w:name w:val="List Paragraph"/>
+    <w:basedOn w:val="Normal"/>
+    <w:uiPriority w:val="34"/>
+    <w:qFormat/>
+    <w:rsid w:val="00CC1B29"/>
+    <w:pPr>
+      <w:ind w:left="720"/>
+      <w:contextualSpacing/>
+    </w:pPr>
+  </w:style>
 </w:styles>
 </file>
 
@@ -6754,10 +6795,10 @@
   <a:themeElements>
     <a:clrScheme name="Office">
       <a:dk1>
-        <a:sysClr val="windowText" lastClr="000000"/>
+        <a:sysClr val="windowText" lastClr="FFFFFF"/>
       </a:dk1>
       <a:lt1>
-        <a:sysClr val="window" lastClr="FFFFFF"/>
+        <a:sysClr val="window" lastClr="000000"/>
       </a:lt1>
       <a:dk2>
         <a:srgbClr val="1F497D"/>

</xml_diff>